<commit_message>
Lexi's first add to the manual
</commit_message>
<xml_diff>
--- a/PREACH-MANUAL.docx
+++ b/PREACH-MANUAL.docx
@@ -25,6 +25,12 @@
       </w:pPr>
       <w:r>
         <w:t>How to move</w:t>
+      </w:r>
+    </w:p>
+    <w:p>
+      <w:r>
+        <w:tab/>
+        <w:t>Press arrows on bottom left of keyboard to move around in game</w:t>
       </w:r>
     </w:p>
     <w:p/>

</xml_diff>

<commit_message>
Add verses to manual
</commit_message>
<xml_diff>
--- a/PREACH-MANUAL.docx
+++ b/PREACH-MANUAL.docx
@@ -56,6 +56,51 @@
       </w:pPr>
       <w:r>
         <w:t>Stock Market</w:t>
+      </w:r>
+    </w:p>
+    <w:p>
+      <w:r>
+        <w:t>Preacher:</w:t>
+      </w:r>
+    </w:p>
+    <w:p>
+      <w:r>
+        <w:t>John 3:16</w:t>
+      </w:r>
+    </w:p>
+    <w:p>
+      <w:r>
+        <w:t>John 8:12</w:t>
+      </w:r>
+    </w:p>
+    <w:p>
+      <w:r>
+        <w:t>Matthew 4:17</w:t>
+      </w:r>
+    </w:p>
+    <w:p>
+      <w:r>
+        <w:t>Matthew 9:22</w:t>
+      </w:r>
+    </w:p>
+    <w:p>
+      <w:r>
+        <w:t>1 Peter 2:24</w:t>
+      </w:r>
+    </w:p>
+    <w:p>
+      <w:r>
+        <w:t>Psalm 140:1</w:t>
+      </w:r>
+    </w:p>
+    <w:p>
+      <w:r>
+        <w:t>2 Samuel 22:33</w:t>
+      </w:r>
+    </w:p>
+    <w:p>
+      <w:r>
+        <w:t>Psalm 46:1</w:t>
       </w:r>
     </w:p>
     <w:sectPr>

</xml_diff>